<commit_message>
edited for Beth comments on methods
</commit_message>
<xml_diff>
--- a/reports/thesis/SI_03_chapter_2.docx
+++ b/reports/thesis/SI_03_chapter_2.docx
@@ -761,321 +761,6 @@
           <w:szCs w:val="22"/>
         </w:rPr>
         <w:lastRenderedPageBreak/>
-        <w:t>Appendix B: Other covariates</w:t>
-      </w:r>
-    </w:p>
-    <w:p>
-      <w:pPr>
-        <w:spacing w:line="480" w:lineRule="auto"/>
-        <w:ind w:firstLine="720"/>
-        <w:rPr>
-          <w:rFonts w:ascii="Arial" w:hAnsi="Arial" w:cs="Arial"/>
-          <w:color w:val="000000" w:themeColor="text1"/>
-          <w:sz w:val="22"/>
-          <w:szCs w:val="22"/>
-        </w:rPr>
-      </w:pPr>
-      <w:r>
-        <w:rPr>
-          <w:rFonts w:ascii="Arial" w:hAnsi="Arial" w:cs="Arial"/>
-          <w:color w:val="000000" w:themeColor="text1"/>
-          <w:sz w:val="22"/>
-          <w:szCs w:val="22"/>
-        </w:rPr>
-        <w:t xml:space="preserve">Since traveling requires both time and energy, we considered the distances of each raven’s territory to the hunting regions. We calculated the commute distance for each raven by taking the Euclidean distance from the center of the 90% MCP to Yellowstone’s northern entrance station in Gardiner, MT, as that was a central location to both hunting regions. </w:t>
-      </w:r>
-    </w:p>
-    <w:p>
-      <w:pPr>
-        <w:spacing w:line="480" w:lineRule="auto"/>
-        <w:ind w:firstLine="720"/>
-        <w:rPr>
-          <w:rFonts w:ascii="Arial" w:hAnsi="Arial" w:cs="Arial"/>
-          <w:color w:val="000000" w:themeColor="text1"/>
-          <w:sz w:val="22"/>
-          <w:szCs w:val="22"/>
-        </w:rPr>
-      </w:pPr>
-      <w:r>
-        <w:rPr>
-          <w:rFonts w:ascii="Arial" w:hAnsi="Arial" w:cs="Arial"/>
-          <w:color w:val="000000" w:themeColor="text1"/>
-          <w:sz w:val="22"/>
-          <w:szCs w:val="22"/>
-        </w:rPr>
-        <w:t>Territory defense and nest construction in early spring may impact a raven’s decision to leave its territory. We accounted for this with a seasonal variable that coded for the two periods during which wolves are intensely monitored (“early study period” = 15 Nov – 15 Dec; “late” = 1 – 31 March)</w:t>
-      </w:r>
-      <w:r>
-        <w:rPr>
-          <w:rFonts w:ascii="Arial" w:hAnsi="Arial" w:cs="Arial"/>
-          <w:color w:val="000000" w:themeColor="text1"/>
-          <w:sz w:val="22"/>
-          <w:szCs w:val="22"/>
-        </w:rPr>
-        <w:t>.</w:t>
-      </w:r>
-    </w:p>
-    <w:p>
-      <w:pPr>
-        <w:spacing w:line="480" w:lineRule="auto"/>
-        <w:ind w:firstLine="720"/>
-        <w:rPr>
-          <w:rFonts w:ascii="Arial" w:hAnsi="Arial" w:cs="Arial"/>
-          <w:color w:val="000000" w:themeColor="text1"/>
-          <w:sz w:val="22"/>
-          <w:szCs w:val="22"/>
-        </w:rPr>
-      </w:pPr>
-      <w:r>
-        <w:rPr>
-          <w:rFonts w:ascii="Arial" w:hAnsi="Arial" w:cs="Arial"/>
-          <w:color w:val="000000" w:themeColor="text1"/>
-          <w:sz w:val="22"/>
-          <w:szCs w:val="22"/>
-        </w:rPr>
-        <w:t xml:space="preserve">Ravens holding territories where wolf kills are frequent may remain on their territories when a kill is not immediately available, as they regularly search such areas </w:t>
-      </w:r>
-      <w:r>
-        <w:rPr>
-          <w:rFonts w:ascii="Arial" w:hAnsi="Arial" w:cs="Arial"/>
-          <w:color w:val="000000" w:themeColor="text1"/>
-          <w:sz w:val="22"/>
-          <w:szCs w:val="22"/>
-        </w:rPr>
-        <w:fldChar w:fldCharType="begin"/>
-      </w:r>
-      <w:r>
-        <w:rPr>
-          <w:rFonts w:ascii="Arial" w:hAnsi="Arial" w:cs="Arial"/>
-          <w:color w:val="000000" w:themeColor="text1"/>
-          <w:sz w:val="22"/>
-          <w:szCs w:val="22"/>
-        </w:rPr>
-        <w:instrText xml:space="preserve"> ADDIN ZOTERO_ITEM CSL_CITATION {"citationID":"d9NJFhBv","properties":{"unsorted":false,"formattedCitation":"(Loretto et al. 2026)","plainCitation":"(Loretto et al. 2026)","noteIndex":0},"citationItems":[{"id":1582,"uris":["http://zotero.org/users/9968163/items/BAM3LF88"],"itemData":{"id":1582,"type":"article-journal","abstract":"Scavengers generally rely on patchily distributed, unpredictable carrion. A long-standing hypothesis suggests scavenging ravens reliably locate such food by directly following large carnivores to their kills. However, by satellite tracking 69 ravens, 20 wolves, and 11 cougars in Yellowstone National Park, we found that following of predators over large distances rarely occurred. Instead, ravens routinely revisited sites where wolf kills were common—returning from distances of up to 155 kilometers to find carrion. Much like navigating to permanent anthropogenic subsidies, ravens appear to remember potential sources of carrion shaped by previous encounters with wolves or their kills. These findings suggest that spatial memory and navigation play a considerably greater role than previously assumed among scavengers, and possibly other wide-ranging species, in search of ephemeral resources.","citation-key":"lorettoRavensAnticipateWolf2026","container-title":"Science","DOI":"10.1126/science.adz9467","issue":"6790","page":"1151-1154","publisher":"American Association for the Advancement of Science","source":"science.org (Atypon)","title":"Ravens anticipate wolf kill sites across broad scales","volume":"391","author":[{"family":"Loretto","given":"Matthias-Claudio"},{"family":"Beck","given":"Kristina B."},{"family":"Smith","given":"Douglas W."},{"family":"Stahler","given":"Daniel R."},{"family":"Walker","given":"Lauren E."},{"family":"Wikelski","given":"Martin"},{"family":"Mueller","given":"Thomas"},{"family":"Safi","given":"Kamran"},{"family":"Marzluff","given":"John M."}],"issued":{"date-parts":[["2026",3,12]]}}}],"schema":"https://github.com/citation-style-language/schema/raw/master/csl-citation.json"} </w:instrText>
-      </w:r>
-      <w:r>
-        <w:rPr>
-          <w:rFonts w:ascii="Arial" w:hAnsi="Arial" w:cs="Arial"/>
-          <w:color w:val="000000" w:themeColor="text1"/>
-          <w:sz w:val="22"/>
-          <w:szCs w:val="22"/>
-        </w:rPr>
-        <w:fldChar w:fldCharType="separate"/>
-      </w:r>
-      <w:r>
-        <w:rPr>
-          <w:rFonts w:ascii="Arial" w:hAnsi="Arial" w:cs="Arial"/>
-          <w:color w:val="000000" w:themeColor="text1"/>
-          <w:sz w:val="22"/>
-          <w:szCs w:val="22"/>
-        </w:rPr>
-        <w:t>(Loretto et al. 2026)</w:t>
-      </w:r>
-      <w:r>
-        <w:rPr>
-          <w:rFonts w:ascii="Arial" w:hAnsi="Arial" w:cs="Arial"/>
-          <w:color w:val="000000" w:themeColor="text1"/>
-          <w:sz w:val="22"/>
-          <w:szCs w:val="22"/>
-        </w:rPr>
-        <w:fldChar w:fldCharType="end"/>
-      </w:r>
-      <w:r>
-        <w:rPr>
-          <w:rFonts w:ascii="Arial" w:hAnsi="Arial" w:cs="Arial"/>
-          <w:color w:val="000000" w:themeColor="text1"/>
-          <w:sz w:val="22"/>
-          <w:szCs w:val="22"/>
-        </w:rPr>
-        <w:t xml:space="preserve">. We calculated the productivity of a raven’s territory as the average number of carcasses acquired by wolves in the 30-day early and late winter periods across all winters that a raven was monitored on that territory. </w:t>
-      </w:r>
-    </w:p>
-    <w:p>
-      <w:pPr>
-        <w:spacing w:line="480" w:lineRule="auto"/>
-        <w:ind w:firstLine="720"/>
-        <w:rPr>
-          <w:rFonts w:ascii="Arial" w:hAnsi="Arial" w:cs="Arial"/>
-          <w:color w:val="000000" w:themeColor="text1"/>
-          <w:sz w:val="22"/>
-          <w:szCs w:val="22"/>
-        </w:rPr>
-      </w:pPr>
-      <w:r>
-        <w:rPr>
-          <w:rFonts w:ascii="Arial" w:hAnsi="Arial" w:cs="Arial"/>
-          <w:color w:val="000000" w:themeColor="text1"/>
-          <w:sz w:val="22"/>
-          <w:szCs w:val="22"/>
-        </w:rPr>
-        <w:t xml:space="preserve">Ravens are social animals that can utilize information sharing to locate foraging opportunities </w:t>
-      </w:r>
-      <w:r>
-        <w:rPr>
-          <w:rFonts w:ascii="Arial" w:hAnsi="Arial" w:cs="Arial"/>
-          <w:color w:val="000000" w:themeColor="text1"/>
-          <w:sz w:val="22"/>
-          <w:szCs w:val="22"/>
-        </w:rPr>
-        <w:fldChar w:fldCharType="begin"/>
-      </w:r>
-      <w:r>
-        <w:rPr>
-          <w:rFonts w:ascii="Arial" w:hAnsi="Arial" w:cs="Arial"/>
-          <w:color w:val="000000" w:themeColor="text1"/>
-          <w:sz w:val="22"/>
-          <w:szCs w:val="22"/>
-        </w:rPr>
-        <w:instrText xml:space="preserve"> ADDIN ZOTERO_ITEM CSL_CITATION {"citationID":"aAvBJWuw","properties":{"formattedCitation":"(Marzluff et al. 1996)","plainCitation":"(Marzluff et al. 1996)","noteIndex":0},"citationItems":[{"id":63,"uris":["http://zotero.org/users/9968163/items/Z8LZESEZ"],"itemData":{"id":63,"type":"article-journal","abstract":"Vagrant, non-breeding common ravens, Corvus corax, inhabiting the forested mountains of Maine are specialized to feed on rich but ephemeral carcasses of large mammals during the harsh winter months. The foraging and roosting behaviour of free-ranging ravens were studied during the winters of 1988–1990. Ravens quickly assembled at carcasses, and into communal roosts. Six lines of evidence indicate that these roosts function as information centres. (1) Roosts comprised both knowledgeable and naive foragers. (2) Departures from roosts were highly synchronized, with most members departing in one direction. (3) Direction of departure often changed from day to day. (4) Birds made naive of food sources (by being withheld from the wild and then allowed to join roosts) followed roost-mates to new feeding sites, whereas control birds held and released outside of roosts rarely found the local food bonanzas. (5) Birds made knowledgeable of food sources (by being released at new carcasses) joined roosts and led roost-mates to the food on three of 20 occasions. (6) The same individuals switched leader and follower roles depending upon their knowledge of feeding opportunities. Although ravens may form roosts at traditional areas (near stable food sources) that are used for many years, the ravens in Maine frequently shifted roost sites to be near newly discovered carcasses. Information exchange at roosts principally occurred on the night of, or the night before, the roost shift. Social soaring displays assembled birds from a wide area and were associated with mass movements to new roosts formed at nearby food.","container-title":"Animal Behaviour","DOI":"10.1006/anbe.1996.0008","ISSN":"00033472","issue":"1","language":"en","page":"89-103","source":"DOI.org (Crossref)","title":"Raven roosts are mobile information centres","volume":"51","author":[{"family":"Marzluff","given":"John M."},{"family":"Heinrich","given":"Bernd"},{"family":"Marzluff","given":"Colleen S."}],"issued":{"date-parts":[["1996",1]]}}}],"schema":"https://github.com/citation-style-language/schema/raw/master/csl-citation.json"} </w:instrText>
-      </w:r>
-      <w:r>
-        <w:rPr>
-          <w:rFonts w:ascii="Arial" w:hAnsi="Arial" w:cs="Arial"/>
-          <w:color w:val="000000" w:themeColor="text1"/>
-          <w:sz w:val="22"/>
-          <w:szCs w:val="22"/>
-        </w:rPr>
-        <w:fldChar w:fldCharType="separate"/>
-      </w:r>
-      <w:r>
-        <w:rPr>
-          <w:rFonts w:ascii="Arial" w:hAnsi="Arial" w:cs="Arial"/>
-          <w:color w:val="000000" w:themeColor="text1"/>
-          <w:sz w:val="22"/>
-          <w:szCs w:val="22"/>
-        </w:rPr>
-        <w:t>(Marzluff et al. 1996)</w:t>
-      </w:r>
-      <w:r>
-        <w:rPr>
-          <w:rFonts w:ascii="Arial" w:hAnsi="Arial" w:cs="Arial"/>
-          <w:color w:val="000000" w:themeColor="text1"/>
-          <w:sz w:val="22"/>
-          <w:szCs w:val="22"/>
-        </w:rPr>
-        <w:fldChar w:fldCharType="end"/>
-      </w:r>
-      <w:r>
-        <w:rPr>
-          <w:rFonts w:ascii="Arial" w:hAnsi="Arial" w:cs="Arial"/>
-          <w:color w:val="000000" w:themeColor="text1"/>
-          <w:sz w:val="22"/>
-          <w:szCs w:val="22"/>
-        </w:rPr>
-        <w:t>. Therefore, we included the proportion of other ravens leaving their territories or visiting the hunting regions on a particular day in our model.</w:t>
-      </w:r>
-    </w:p>
-    <w:p>
-      <w:pPr>
-        <w:spacing w:line="480" w:lineRule="auto"/>
-        <w:ind w:firstLine="720"/>
-        <w:rPr>
-          <w:rFonts w:ascii="Arial" w:hAnsi="Arial" w:cs="Arial"/>
-          <w:color w:val="000000" w:themeColor="text1"/>
-          <w:sz w:val="22"/>
-          <w:szCs w:val="22"/>
-        </w:rPr>
-      </w:pPr>
-      <w:r>
-        <w:rPr>
-          <w:rFonts w:ascii="Arial" w:hAnsi="Arial" w:cs="Arial"/>
-          <w:color w:val="000000" w:themeColor="text1"/>
-          <w:sz w:val="22"/>
-          <w:szCs w:val="22"/>
-        </w:rPr>
-        <w:t xml:space="preserve">Yellowstone ravens were previously found to leave the park most frequently when spring snowpack was deep (Walker et al. 2018). </w:t>
-      </w:r>
-      <w:r>
-        <w:rPr>
-          <w:rFonts w:ascii="Arial" w:hAnsi="Arial" w:cs="Arial"/>
-          <w:color w:val="000000" w:themeColor="text1"/>
-          <w:sz w:val="22"/>
-          <w:szCs w:val="22"/>
-        </w:rPr>
-        <w:t>We</w:t>
-      </w:r>
-      <w:r>
-        <w:rPr>
-          <w:rFonts w:ascii="Arial" w:hAnsi="Arial" w:cs="Arial"/>
-          <w:color w:val="000000" w:themeColor="text1"/>
-          <w:sz w:val="22"/>
-          <w:szCs w:val="22"/>
-        </w:rPr>
-        <w:t xml:space="preserve"> account for this</w:t>
-      </w:r>
-      <w:r>
-        <w:rPr>
-          <w:rFonts w:ascii="Arial" w:hAnsi="Arial" w:cs="Arial"/>
-          <w:color w:val="000000" w:themeColor="text1"/>
-          <w:sz w:val="22"/>
-          <w:szCs w:val="22"/>
-        </w:rPr>
-        <w:t xml:space="preserve"> by</w:t>
-      </w:r>
-      <w:r>
-        <w:rPr>
-          <w:rFonts w:ascii="Arial" w:hAnsi="Arial" w:cs="Arial"/>
-          <w:color w:val="000000" w:themeColor="text1"/>
-          <w:sz w:val="22"/>
-          <w:szCs w:val="22"/>
-        </w:rPr>
-        <w:t xml:space="preserve"> includ</w:t>
-      </w:r>
-      <w:r>
-        <w:rPr>
-          <w:rFonts w:ascii="Arial" w:hAnsi="Arial" w:cs="Arial"/>
-          <w:color w:val="000000" w:themeColor="text1"/>
-          <w:sz w:val="22"/>
-          <w:szCs w:val="22"/>
-        </w:rPr>
-        <w:t>ing</w:t>
-      </w:r>
-      <w:r>
-        <w:rPr>
-          <w:rFonts w:ascii="Arial" w:hAnsi="Arial" w:cs="Arial"/>
-          <w:color w:val="000000" w:themeColor="text1"/>
-          <w:sz w:val="22"/>
-          <w:szCs w:val="22"/>
-        </w:rPr>
-        <w:t xml:space="preserve"> snow depth and maximum daily temperature from Mammoth, WY, (National Center for Environmental Information), as covariates. </w:t>
-      </w:r>
-    </w:p>
-    <w:p>
-      <w:pPr>
-        <w:spacing w:line="480" w:lineRule="auto"/>
-        <w:jc w:val="center"/>
-        <w:rPr>
-          <w:rFonts w:ascii="Arial" w:hAnsi="Arial" w:cs="Arial"/>
-          <w:sz w:val="22"/>
-          <w:szCs w:val="22"/>
-        </w:rPr>
-      </w:pPr>
-      <w:r>
-        <w:rPr>
-          <w:rFonts w:ascii="Arial" w:hAnsi="Arial" w:cs="Arial"/>
-          <w:sz w:val="22"/>
-          <w:szCs w:val="22"/>
-        </w:rPr>
-        <w:br w:type="page"/>
-      </w:r>
-    </w:p>
-    <w:p>
-      <w:pPr>
-        <w:spacing w:line="480" w:lineRule="auto"/>
-        <w:jc w:val="center"/>
-        <w:rPr>
-          <w:rFonts w:ascii="Arial" w:hAnsi="Arial" w:cs="Arial"/>
-          <w:sz w:val="22"/>
-          <w:szCs w:val="22"/>
-        </w:rPr>
-      </w:pPr>
-      <w:r>
-        <w:rPr>
-          <w:rFonts w:ascii="Arial" w:hAnsi="Arial" w:cs="Arial"/>
-          <w:sz w:val="22"/>
-          <w:szCs w:val="22"/>
-        </w:rPr>
-        <w:lastRenderedPageBreak/>
         <w:t xml:space="preserve">Appendix </w:t>
       </w:r>
       <w:r>
@@ -1084,7 +769,7 @@
           <w:sz w:val="22"/>
           <w:szCs w:val="22"/>
         </w:rPr>
-        <w:t>C</w:t>
+        <w:t>B</w:t>
       </w:r>
       <w:r>
         <w:rPr>
@@ -1456,7 +1141,7 @@
           <w:sz w:val="22"/>
           <w:szCs w:val="22"/>
         </w:rPr>
-        <w:t>D</w:t>
+        <w:t>C</w:t>
       </w:r>
       <w:r>
         <w:rPr>
@@ -1506,7 +1191,23 @@
           <w:sz w:val="22"/>
           <w:szCs w:val="22"/>
         </w:rPr>
-        <w:t xml:space="preserve">Supplemental Table 2. </w:t>
+        <w:t xml:space="preserve">Supplemental Table </w:t>
+      </w:r>
+      <w:r>
+        <w:rPr>
+          <w:rFonts w:ascii="Arial" w:hAnsi="Arial" w:cs="Arial"/>
+          <w:sz w:val="22"/>
+          <w:szCs w:val="22"/>
+        </w:rPr>
+        <w:t>3</w:t>
+      </w:r>
+      <w:r>
+        <w:rPr>
+          <w:rFonts w:ascii="Arial" w:hAnsi="Arial" w:cs="Arial"/>
+          <w:sz w:val="22"/>
+          <w:szCs w:val="22"/>
+        </w:rPr>
+        <w:t xml:space="preserve">. </w:t>
       </w:r>
       <w:r>
         <w:rPr>
@@ -1665,6 +1366,14 @@
           <w:szCs w:val="22"/>
         </w:rPr>
         <w:lastRenderedPageBreak/>
+        <w:t xml:space="preserve">Supplemental </w:t>
+      </w:r>
+      <w:r>
+        <w:rPr>
+          <w:rFonts w:ascii="Arial" w:hAnsi="Arial" w:cs="Arial"/>
+          <w:sz w:val="22"/>
+          <w:szCs w:val="22"/>
+        </w:rPr>
         <w:t xml:space="preserve">Table </w:t>
       </w:r>
       <w:r>
@@ -2412,6 +2121,7 @@
   <w:style w:type="character" w:default="1" w:styleId="DefaultParagraphFont">
     <w:name w:val="Default Paragraph Font"/>
     <w:uiPriority w:val="1"/>
+    <w:semiHidden/>
     <w:unhideWhenUsed/>
   </w:style>
   <w:style w:type="table" w:default="1" w:styleId="TableNormal">

</xml_diff>

<commit_message>
updated with edits for thesis (doesn't match final thesis copy)
</commit_message>
<xml_diff>
--- a/reports/thesis/SI_03_chapter_2.docx
+++ b/reports/thesis/SI_03_chapter_2.docx
@@ -4,6 +4,7 @@
   <w:body>
     <w:p>
       <w:pPr>
+        <w:spacing w:line="480" w:lineRule="auto"/>
         <w:jc w:val="center"/>
         <w:rPr>
           <w:rFonts w:ascii="Arial" w:hAnsi="Arial" w:cs="Arial"/>
@@ -22,6 +23,7 @@
     </w:p>
     <w:p>
       <w:pPr>
+        <w:spacing w:line="480" w:lineRule="auto"/>
         <w:jc w:val="center"/>
         <w:rPr>
           <w:rFonts w:ascii="Arial" w:hAnsi="Arial" w:cs="Arial"/>
@@ -88,6 +90,7 @@
     </w:p>
     <w:p>
       <w:pPr>
+        <w:spacing w:line="480" w:lineRule="auto"/>
         <w:rPr>
           <w:rFonts w:ascii="Arial" w:hAnsi="Arial" w:cs="Arial"/>
           <w:sz w:val="22"/>
@@ -852,15 +855,6 @@
           <w:szCs w:val="22"/>
         </w:rPr>
       </w:pPr>
-    </w:p>
-    <w:p>
-      <w:pPr>
-        <w:rPr>
-          <w:rFonts w:ascii="Arial" w:hAnsi="Arial" w:cs="Arial"/>
-          <w:sz w:val="22"/>
-          <w:szCs w:val="22"/>
-        </w:rPr>
-      </w:pPr>
       <w:r>
         <w:rPr>
           <w:rFonts w:ascii="Arial" w:hAnsi="Arial" w:cs="Arial"/>
@@ -887,6 +881,158 @@
           <w:szCs w:val="22"/>
         </w:rPr>
         <w:lastRenderedPageBreak/>
+        <w:t xml:space="preserve">Appendix C: </w:t>
+      </w:r>
+      <w:r>
+        <w:rPr>
+          <w:rFonts w:ascii="Arial" w:hAnsi="Arial" w:cs="Arial"/>
+          <w:sz w:val="22"/>
+          <w:szCs w:val="22"/>
+        </w:rPr>
+        <w:t>Location of all breeding territories</w:t>
+      </w:r>
+    </w:p>
+    <w:p>
+      <w:pPr>
+        <w:spacing w:line="480" w:lineRule="auto"/>
+        <w:rPr>
+          <w:rFonts w:ascii="Arial" w:hAnsi="Arial" w:cs="Arial"/>
+          <w:sz w:val="22"/>
+          <w:szCs w:val="22"/>
+        </w:rPr>
+      </w:pPr>
+      <w:r>
+        <w:rPr>
+          <w:rFonts w:ascii="Arial" w:hAnsi="Arial" w:cs="Arial"/>
+          <w:noProof/>
+          <w:sz w:val="22"/>
+          <w:szCs w:val="22"/>
+        </w:rPr>
+        <w:drawing>
+          <wp:inline distT="0" distB="0" distL="0" distR="0" wp14:anchorId="7CF54163" wp14:editId="2245F4F0">
+            <wp:extent cx="5937885" cy="4542790"/>
+            <wp:effectExtent l="0" t="0" r="5715" b="0"/>
+            <wp:docPr id="1160349665" name="Picture 1"/>
+            <wp:cNvGraphicFramePr>
+              <a:graphicFrameLocks xmlns:a="http://schemas.openxmlformats.org/drawingml/2006/main" noChangeAspect="1"/>
+            </wp:cNvGraphicFramePr>
+            <a:graphic xmlns:a="http://schemas.openxmlformats.org/drawingml/2006/main">
+              <a:graphicData uri="http://schemas.openxmlformats.org/drawingml/2006/picture">
+                <pic:pic xmlns:pic="http://schemas.openxmlformats.org/drawingml/2006/picture">
+                  <pic:nvPicPr>
+                    <pic:cNvPr id="0" name="Picture 1"/>
+                    <pic:cNvPicPr>
+                      <a:picLocks noChangeAspect="1" noChangeArrowheads="1"/>
+                    </pic:cNvPicPr>
+                  </pic:nvPicPr>
+                  <pic:blipFill>
+                    <a:blip r:embed="rId6" cstate="print">
+                      <a:extLst>
+                        <a:ext uri="{28A0092B-C50C-407E-A947-70E740481C1C}">
+                          <a14:useLocalDpi xmlns:a14="http://schemas.microsoft.com/office/drawing/2010/main" val="0"/>
+                        </a:ext>
+                      </a:extLst>
+                    </a:blip>
+                    <a:srcRect/>
+                    <a:stretch>
+                      <a:fillRect/>
+                    </a:stretch>
+                  </pic:blipFill>
+                  <pic:spPr bwMode="auto">
+                    <a:xfrm>
+                      <a:off x="0" y="0"/>
+                      <a:ext cx="5937885" cy="4542790"/>
+                    </a:xfrm>
+                    <a:prstGeom prst="rect">
+                      <a:avLst/>
+                    </a:prstGeom>
+                    <a:noFill/>
+                    <a:ln>
+                      <a:noFill/>
+                    </a:ln>
+                  </pic:spPr>
+                </pic:pic>
+              </a:graphicData>
+            </a:graphic>
+          </wp:inline>
+        </w:drawing>
+      </w:r>
+    </w:p>
+    <w:p>
+      <w:pPr>
+        <w:spacing w:line="480" w:lineRule="auto"/>
+        <w:rPr>
+          <w:rFonts w:ascii="Arial" w:hAnsi="Arial" w:cs="Arial"/>
+          <w:sz w:val="22"/>
+          <w:szCs w:val="22"/>
+        </w:rPr>
+      </w:pPr>
+      <w:r>
+        <w:rPr>
+          <w:rFonts w:ascii="Arial" w:hAnsi="Arial" w:cs="Arial"/>
+          <w:sz w:val="22"/>
+          <w:szCs w:val="22"/>
+        </w:rPr>
+        <w:t>Supplemental Figure 2. Locations of all raven breeding territories monitored. Polygons are the 90% MCP calculated for each GPS tagged raven. Blue dots indicate raven territories that were monitored</w:t>
+      </w:r>
+      <w:r>
+        <w:rPr>
+          <w:rFonts w:ascii="Arial" w:hAnsi="Arial" w:cs="Arial"/>
+          <w:sz w:val="22"/>
+          <w:szCs w:val="22"/>
+        </w:rPr>
+        <w:t xml:space="preserve"> for breeding success,</w:t>
+      </w:r>
+      <w:r>
+        <w:rPr>
+          <w:rFonts w:ascii="Arial" w:hAnsi="Arial" w:cs="Arial"/>
+          <w:sz w:val="22"/>
+          <w:szCs w:val="22"/>
+        </w:rPr>
+        <w:t xml:space="preserve"> but did not </w:t>
+      </w:r>
+      <w:r>
+        <w:rPr>
+          <w:rFonts w:ascii="Arial" w:hAnsi="Arial" w:cs="Arial"/>
+          <w:sz w:val="22"/>
+          <w:szCs w:val="22"/>
+        </w:rPr>
+        <w:t>include</w:t>
+      </w:r>
+      <w:r>
+        <w:rPr>
+          <w:rFonts w:ascii="Arial" w:hAnsi="Arial" w:cs="Arial"/>
+          <w:sz w:val="22"/>
+          <w:szCs w:val="22"/>
+        </w:rPr>
+        <w:t xml:space="preserve"> a GPS tagged raven.</w:t>
+      </w:r>
+      <w:r>
+        <w:rPr>
+          <w:rFonts w:ascii="Arial" w:hAnsi="Arial" w:cs="Arial"/>
+          <w:sz w:val="22"/>
+          <w:szCs w:val="22"/>
+        </w:rPr>
+        <w:br w:type="page"/>
+      </w:r>
+    </w:p>
+    <w:p>
+      <w:pPr>
+        <w:spacing w:line="480" w:lineRule="auto"/>
+        <w:jc w:val="center"/>
+        <w:rPr>
+          <w:rFonts w:ascii="Arial" w:hAnsi="Arial" w:cs="Arial"/>
+          <w:sz w:val="22"/>
+          <w:szCs w:val="22"/>
+        </w:rPr>
+      </w:pPr>
+      <w:r>
+        <w:rPr>
+          <w:rFonts w:ascii="Arial" w:hAnsi="Arial" w:cs="Arial"/>
+          <w:sz w:val="22"/>
+          <w:szCs w:val="22"/>
+        </w:rPr>
+        <w:lastRenderedPageBreak/>
         <w:t xml:space="preserve">Appendix </w:t>
       </w:r>
       <w:r>
@@ -895,7 +1041,7 @@
           <w:sz w:val="22"/>
           <w:szCs w:val="22"/>
         </w:rPr>
-        <w:t>C</w:t>
+        <w:t>D</w:t>
       </w:r>
       <w:r>
         <w:rPr>
@@ -1458,7 +1604,7 @@
           <w:sz w:val="22"/>
           <w:szCs w:val="22"/>
         </w:rPr>
-        <w:t>D</w:t>
+        <w:t>E</w:t>
       </w:r>
       <w:r>
         <w:rPr>
@@ -1626,7 +1772,7 @@
                     </pic:cNvPicPr>
                   </pic:nvPicPr>
                   <pic:blipFill>
-                    <a:blip r:embed="rId6">
+                    <a:blip r:embed="rId7">
                       <a:extLst>
                         <a:ext uri="{28A0092B-C50C-407E-A947-70E740481C1C}">
                           <a14:useLocalDpi xmlns:a14="http://schemas.microsoft.com/office/drawing/2010/main" val="0"/>
@@ -1792,7 +1938,7 @@
                     </pic:cNvPicPr>
                   </pic:nvPicPr>
                   <pic:blipFill>
-                    <a:blip r:embed="rId7">
+                    <a:blip r:embed="rId8">
                       <a:extLst>
                         <a:ext uri="{28A0092B-C50C-407E-A947-70E740481C1C}">
                           <a14:useLocalDpi xmlns:a14="http://schemas.microsoft.com/office/drawing/2010/main" val="0"/>

</xml_diff>

<commit_message>
added biomass sensitivity analysis
</commit_message>
<xml_diff>
--- a/reports/thesis/SI_03_chapter_2.docx
+++ b/reports/thesis/SI_03_chapter_2.docx
@@ -1694,7 +1694,16 @@
           <w:sz w:val="22"/>
           <w:szCs w:val="22"/>
         </w:rPr>
-        <w:t xml:space="preserve"> on the probability of ravens leaving their territory daily (n</w:t>
+        <w:t xml:space="preserve"> on the probability of ravens leaving their territory daily (</w:t>
+      </w:r>
+      <w:proofErr w:type="spellStart"/>
+      <w:r>
+        <w:rPr>
+          <w:rFonts w:ascii="Arial" w:hAnsi="Arial" w:cs="Arial"/>
+          <w:sz w:val="22"/>
+          <w:szCs w:val="22"/>
+        </w:rPr>
+        <w:t>n</w:t>
       </w:r>
       <w:r>
         <w:rPr>
@@ -1705,6 +1714,7 @@
         </w:rPr>
         <w:t>days</w:t>
       </w:r>
+      <w:proofErr w:type="spellEnd"/>
       <w:r>
         <w:rPr>
           <w:rFonts w:ascii="Arial" w:hAnsi="Arial" w:cs="Arial"/>
@@ -1755,10 +1765,10 @@
           <w:szCs w:val="22"/>
         </w:rPr>
         <w:drawing>
-          <wp:inline distT="0" distB="0" distL="0" distR="0" wp14:anchorId="6E2647E4" wp14:editId="5BFCFFB3">
-            <wp:extent cx="3187700" cy="3111500"/>
-            <wp:effectExtent l="0" t="0" r="0" b="0"/>
-            <wp:docPr id="1825694435" name="Picture 1"/>
+          <wp:inline distT="0" distB="0" distL="0" distR="0" wp14:anchorId="2CB74554" wp14:editId="481DB785">
+            <wp:extent cx="3298825" cy="3136900"/>
+            <wp:effectExtent l="0" t="0" r="0" b="6350"/>
+            <wp:docPr id="2113255577" name="Picture 3"/>
             <wp:cNvGraphicFramePr>
               <a:graphicFrameLocks xmlns:a="http://schemas.openxmlformats.org/drawingml/2006/main" noChangeAspect="1"/>
             </wp:cNvGraphicFramePr>
@@ -1766,7 +1776,7 @@
               <a:graphicData uri="http://schemas.openxmlformats.org/drawingml/2006/picture">
                 <pic:pic xmlns:pic="http://schemas.openxmlformats.org/drawingml/2006/picture">
                   <pic:nvPicPr>
-                    <pic:cNvPr id="0" name="Picture 1"/>
+                    <pic:cNvPr id="0" name="Picture 3"/>
                     <pic:cNvPicPr>
                       <a:picLocks noChangeAspect="1" noChangeArrowheads="1"/>
                     </pic:cNvPicPr>
@@ -1787,7 +1797,7 @@
                   <pic:spPr bwMode="auto">
                     <a:xfrm>
                       <a:off x="0" y="0"/>
-                      <a:ext cx="3187700" cy="3111500"/>
+                      <a:ext cx="3298825" cy="3136900"/>
                     </a:xfrm>
                     <a:prstGeom prst="rect">
                       <a:avLst/>
@@ -1852,7 +1862,16 @@
           <w:sz w:val="22"/>
           <w:szCs w:val="22"/>
         </w:rPr>
-        <w:t>. Model results from the binomial generalized linear mixed model looking at the impact of covariates on the probability of ravens visiting the hunting areas surrounding Gardiner, MT when they choose to leave their territory daily (n</w:t>
+        <w:t>. Model results from the binomial generalized linear mixed model looking at the impact of covariates on the probability of ravens visiting the hunting areas surrounding Gardiner, MT when they choose to leave their territory daily (</w:t>
+      </w:r>
+      <w:proofErr w:type="spellStart"/>
+      <w:r>
+        <w:rPr>
+          <w:rFonts w:ascii="Arial" w:hAnsi="Arial" w:cs="Arial"/>
+          <w:sz w:val="22"/>
+          <w:szCs w:val="22"/>
+        </w:rPr>
+        <w:t>n</w:t>
       </w:r>
       <w:r>
         <w:rPr>
@@ -1863,6 +1882,7 @@
         </w:rPr>
         <w:t>days</w:t>
       </w:r>
+      <w:proofErr w:type="spellEnd"/>
       <w:r>
         <w:rPr>
           <w:rFonts w:ascii="Arial" w:hAnsi="Arial" w:cs="Arial"/>
@@ -1921,10 +1941,10 @@
           <w:szCs w:val="22"/>
         </w:rPr>
         <w:drawing>
-          <wp:inline distT="0" distB="0" distL="0" distR="0" wp14:anchorId="378935F9" wp14:editId="598F623E">
-            <wp:extent cx="3162300" cy="2393950"/>
-            <wp:effectExtent l="0" t="0" r="0" b="6350"/>
-            <wp:docPr id="789464165" name="Picture 2"/>
+          <wp:inline distT="0" distB="0" distL="0" distR="0" wp14:anchorId="6F756E68" wp14:editId="7290F381">
+            <wp:extent cx="3165475" cy="2419350"/>
+            <wp:effectExtent l="0" t="0" r="0" b="0"/>
+            <wp:docPr id="1001020433" name="Picture 1"/>
             <wp:cNvGraphicFramePr>
               <a:graphicFrameLocks xmlns:a="http://schemas.openxmlformats.org/drawingml/2006/main" noChangeAspect="1"/>
             </wp:cNvGraphicFramePr>
@@ -1932,7 +1952,7 @@
               <a:graphicData uri="http://schemas.openxmlformats.org/drawingml/2006/picture">
                 <pic:pic xmlns:pic="http://schemas.openxmlformats.org/drawingml/2006/picture">
                   <pic:nvPicPr>
-                    <pic:cNvPr id="0" name="Picture 2"/>
+                    <pic:cNvPr id="0" name="Picture 1"/>
                     <pic:cNvPicPr>
                       <a:picLocks noChangeAspect="1" noChangeArrowheads="1"/>
                     </pic:cNvPicPr>
@@ -1953,7 +1973,7 @@
                   <pic:spPr bwMode="auto">
                     <a:xfrm>
                       <a:off x="0" y="0"/>
-                      <a:ext cx="3162300" cy="2393950"/>
+                      <a:ext cx="3165475" cy="2419350"/>
                     </a:xfrm>
                     <a:prstGeom prst="rect">
                       <a:avLst/>
@@ -1968,6 +1988,1017 @@
             </a:graphic>
           </wp:inline>
         </w:drawing>
+      </w:r>
+    </w:p>
+    <w:p>
+      <w:pPr>
+        <w:rPr>
+          <w:rFonts w:ascii="Arial" w:hAnsi="Arial" w:cs="Arial"/>
+          <w:sz w:val="22"/>
+          <w:szCs w:val="22"/>
+        </w:rPr>
+      </w:pPr>
+      <w:r>
+        <w:rPr>
+          <w:rFonts w:ascii="Arial" w:hAnsi="Arial" w:cs="Arial"/>
+          <w:sz w:val="22"/>
+          <w:szCs w:val="22"/>
+        </w:rPr>
+        <w:br w:type="page"/>
+      </w:r>
+    </w:p>
+    <w:p>
+      <w:pPr>
+        <w:spacing w:line="480" w:lineRule="auto"/>
+        <w:jc w:val="center"/>
+        <w:rPr>
+          <w:rFonts w:ascii="Arial" w:hAnsi="Arial" w:cs="Arial"/>
+          <w:sz w:val="22"/>
+          <w:szCs w:val="22"/>
+        </w:rPr>
+      </w:pPr>
+      <w:r>
+        <w:rPr>
+          <w:rFonts w:ascii="Arial" w:hAnsi="Arial" w:cs="Arial"/>
+          <w:sz w:val="22"/>
+          <w:szCs w:val="22"/>
+        </w:rPr>
+        <w:lastRenderedPageBreak/>
+        <w:t>Appendix: Sensitivity analysis for recreational hunting biomass estimate</w:t>
+      </w:r>
+    </w:p>
+    <w:p>
+      <w:pPr>
+        <w:spacing w:line="480" w:lineRule="auto"/>
+        <w:rPr>
+          <w:rFonts w:ascii="Arial" w:hAnsi="Arial" w:cs="Arial"/>
+          <w:sz w:val="22"/>
+          <w:szCs w:val="22"/>
+        </w:rPr>
+      </w:pPr>
+      <w:r>
+        <w:rPr>
+          <w:rFonts w:ascii="Arial" w:hAnsi="Arial" w:cs="Arial"/>
+          <w:sz w:val="22"/>
+          <w:szCs w:val="22"/>
+        </w:rPr>
+        <w:t xml:space="preserve">Our estimation of biomass created during the MTFWP rifle hunting season is speculative given data reported by MTFWP is not daily and is instead an estimate for the hunting district over the entire hunting period. To support these estimates and ensure they are not having an adverse </w:t>
+      </w:r>
+      <w:r>
+        <w:rPr>
+          <w:rFonts w:ascii="Arial" w:hAnsi="Arial" w:cs="Arial"/>
+          <w:sz w:val="22"/>
+          <w:szCs w:val="22"/>
+        </w:rPr>
+        <w:t>e</w:t>
+      </w:r>
+      <w:r>
+        <w:rPr>
+          <w:rFonts w:ascii="Arial" w:hAnsi="Arial" w:cs="Arial"/>
+          <w:sz w:val="22"/>
+          <w:szCs w:val="22"/>
+        </w:rPr>
+        <w:t>ffect on our results, we conduct a sensitivity analysis here using the bison hunting biomass. The bison hunt is monitored closely by the NPS Bison Project and</w:t>
+      </w:r>
+      <w:r>
+        <w:rPr>
+          <w:rFonts w:ascii="Arial" w:hAnsi="Arial" w:cs="Arial"/>
+          <w:sz w:val="22"/>
+          <w:szCs w:val="22"/>
+        </w:rPr>
+        <w:t xml:space="preserve"> hunter</w:t>
+      </w:r>
+      <w:r>
+        <w:rPr>
+          <w:rFonts w:ascii="Arial" w:hAnsi="Arial" w:cs="Arial"/>
+          <w:sz w:val="22"/>
+          <w:szCs w:val="22"/>
+        </w:rPr>
+        <w:t xml:space="preserve"> take is surveyed daily throughout the winter through communication with tribal hunters, game wardens, and park officials.</w:t>
+      </w:r>
+    </w:p>
+    <w:p>
+      <w:pPr>
+        <w:spacing w:line="480" w:lineRule="auto"/>
+        <w:rPr>
+          <w:rFonts w:ascii="Arial" w:hAnsi="Arial" w:cs="Arial"/>
+          <w:b/>
+          <w:bCs/>
+          <w:sz w:val="22"/>
+          <w:szCs w:val="22"/>
+        </w:rPr>
+      </w:pPr>
+      <w:r>
+        <w:rPr>
+          <w:rFonts w:ascii="Arial" w:hAnsi="Arial" w:cs="Arial"/>
+          <w:b/>
+          <w:bCs/>
+          <w:sz w:val="22"/>
+          <w:szCs w:val="22"/>
+        </w:rPr>
+        <w:t>Methods</w:t>
+      </w:r>
+    </w:p>
+    <w:p>
+      <w:pPr>
+        <w:spacing w:line="480" w:lineRule="auto"/>
+        <w:rPr>
+          <w:rFonts w:ascii="Arial" w:hAnsi="Arial" w:cs="Arial"/>
+          <w:sz w:val="22"/>
+          <w:szCs w:val="22"/>
+        </w:rPr>
+      </w:pPr>
+      <w:r>
+        <w:rPr>
+          <w:rFonts w:ascii="Arial" w:hAnsi="Arial" w:cs="Arial"/>
+          <w:sz w:val="22"/>
+          <w:szCs w:val="22"/>
+        </w:rPr>
+        <w:t xml:space="preserve">To test the impacts of our biomass estimations for the MTFWP season, we reran both models using only the March 1 – 30 period when biomass take is more reliable given its sampling method. </w:t>
+      </w:r>
+      <w:r>
+        <w:rPr>
+          <w:rFonts w:ascii="Arial" w:hAnsi="Arial" w:cs="Arial"/>
+          <w:sz w:val="22"/>
+          <w:szCs w:val="22"/>
+        </w:rPr>
+        <w:t>The only change in model structure is that the</w:t>
+      </w:r>
+      <w:r>
+        <w:rPr>
+          <w:rFonts w:ascii="Arial" w:hAnsi="Arial" w:cs="Arial"/>
+          <w:sz w:val="22"/>
+          <w:szCs w:val="22"/>
+        </w:rPr>
+        <w:t xml:space="preserve"> </w:t>
+      </w:r>
+      <w:proofErr w:type="spellStart"/>
+      <w:r>
+        <w:rPr>
+          <w:rFonts w:ascii="Arial" w:hAnsi="Arial" w:cs="Arial"/>
+          <w:i/>
+          <w:iCs/>
+          <w:sz w:val="22"/>
+          <w:szCs w:val="22"/>
+        </w:rPr>
+        <w:t>LateWinter</w:t>
+      </w:r>
+      <w:proofErr w:type="spellEnd"/>
+      <w:r>
+        <w:rPr>
+          <w:rFonts w:ascii="Arial" w:hAnsi="Arial" w:cs="Arial"/>
+          <w:sz w:val="22"/>
+          <w:szCs w:val="22"/>
+        </w:rPr>
+        <w:t xml:space="preserve"> </w:t>
+      </w:r>
+      <w:r>
+        <w:rPr>
+          <w:rFonts w:ascii="Arial" w:hAnsi="Arial" w:cs="Arial"/>
+          <w:sz w:val="22"/>
+          <w:szCs w:val="22"/>
+        </w:rPr>
+        <w:t xml:space="preserve">covariate </w:t>
+      </w:r>
+      <w:r>
+        <w:rPr>
+          <w:rFonts w:ascii="Arial" w:hAnsi="Arial" w:cs="Arial"/>
+          <w:sz w:val="22"/>
+          <w:szCs w:val="22"/>
+        </w:rPr>
+        <w:t xml:space="preserve">was removed as the early winter period is not included. </w:t>
+      </w:r>
+    </w:p>
+    <w:p>
+      <w:pPr>
+        <w:spacing w:line="480" w:lineRule="auto"/>
+        <w:rPr>
+          <w:rFonts w:ascii="Arial" w:hAnsi="Arial" w:cs="Arial"/>
+          <w:b/>
+          <w:bCs/>
+          <w:sz w:val="22"/>
+          <w:szCs w:val="22"/>
+        </w:rPr>
+      </w:pPr>
+      <w:r>
+        <w:rPr>
+          <w:rFonts w:ascii="Arial" w:hAnsi="Arial" w:cs="Arial"/>
+          <w:b/>
+          <w:bCs/>
+          <w:sz w:val="22"/>
+          <w:szCs w:val="22"/>
+        </w:rPr>
+        <w:t>Results</w:t>
+      </w:r>
+    </w:p>
+    <w:p>
+      <w:pPr>
+        <w:spacing w:line="480" w:lineRule="auto"/>
+        <w:rPr>
+          <w:rFonts w:ascii="Arial" w:hAnsi="Arial" w:cs="Arial"/>
+          <w:sz w:val="22"/>
+          <w:szCs w:val="22"/>
+        </w:rPr>
+      </w:pPr>
+      <w:r>
+        <w:rPr>
+          <w:rFonts w:ascii="Arial" w:hAnsi="Arial" w:cs="Arial"/>
+          <w:sz w:val="22"/>
+          <w:szCs w:val="22"/>
+        </w:rPr>
+        <w:t>Examining the covariates during the tribal bison hunting periods, when daily take was sampled (instead of calculated, such as the MTFWP hunting season)</w:t>
+      </w:r>
+      <w:r>
+        <w:rPr>
+          <w:rFonts w:ascii="Arial" w:hAnsi="Arial" w:cs="Arial"/>
+          <w:sz w:val="22"/>
+          <w:szCs w:val="22"/>
+        </w:rPr>
+        <w:t>,</w:t>
+      </w:r>
+      <w:r>
+        <w:rPr>
+          <w:rFonts w:ascii="Arial" w:hAnsi="Arial" w:cs="Arial"/>
+          <w:sz w:val="22"/>
+          <w:szCs w:val="22"/>
+        </w:rPr>
+        <w:t xml:space="preserve"> </w:t>
+      </w:r>
+      <w:r>
+        <w:rPr>
+          <w:rFonts w:ascii="Arial" w:hAnsi="Arial" w:cs="Arial"/>
+          <w:sz w:val="22"/>
+          <w:szCs w:val="22"/>
+        </w:rPr>
+        <w:t>res</w:t>
+      </w:r>
+      <w:r>
+        <w:rPr>
+          <w:rFonts w:ascii="Arial" w:hAnsi="Arial" w:cs="Arial"/>
+          <w:sz w:val="22"/>
+          <w:szCs w:val="22"/>
+        </w:rPr>
+        <w:t>ult</w:t>
+      </w:r>
+      <w:r>
+        <w:rPr>
+          <w:rFonts w:ascii="Arial" w:hAnsi="Arial" w:cs="Arial"/>
+          <w:sz w:val="22"/>
+          <w:szCs w:val="22"/>
+        </w:rPr>
+        <w:t>ed in similar effects</w:t>
+      </w:r>
+      <w:r>
+        <w:rPr>
+          <w:rFonts w:ascii="Arial" w:hAnsi="Arial" w:cs="Arial"/>
+          <w:sz w:val="22"/>
+          <w:szCs w:val="22"/>
+        </w:rPr>
+        <w:t xml:space="preserve"> to the full models.</w:t>
+      </w:r>
+      <w:r>
+        <w:rPr>
+          <w:rFonts w:ascii="Arial" w:hAnsi="Arial" w:cs="Arial"/>
+          <w:sz w:val="22"/>
+          <w:szCs w:val="22"/>
+        </w:rPr>
+        <w:t xml:space="preserve"> For the first decision, the covariates representing wolf and recreational hunting had the same significance while the effect size remained similar (Supp. Table 3, 5)</w:t>
+      </w:r>
+      <w:r>
+        <w:rPr>
+          <w:rFonts w:ascii="Arial" w:hAnsi="Arial" w:cs="Arial"/>
+          <w:sz w:val="22"/>
+          <w:szCs w:val="22"/>
+        </w:rPr>
+        <w:t xml:space="preserve">. </w:t>
+      </w:r>
+      <w:r>
+        <w:rPr>
+          <w:rFonts w:ascii="Arial" w:hAnsi="Arial" w:cs="Arial"/>
+          <w:sz w:val="22"/>
+          <w:szCs w:val="22"/>
+        </w:rPr>
+        <w:t xml:space="preserve">Snow </w:t>
+      </w:r>
+      <w:r>
+        <w:rPr>
+          <w:rFonts w:ascii="Arial" w:hAnsi="Arial" w:cs="Arial"/>
+          <w:sz w:val="22"/>
+          <w:szCs w:val="22"/>
+        </w:rPr>
+        <w:t xml:space="preserve">and social factors are now not significant in the more restricted model (p &gt; 0.29). </w:t>
+      </w:r>
+      <w:r>
+        <w:rPr>
+          <w:rFonts w:ascii="Arial" w:hAnsi="Arial" w:cs="Arial"/>
+          <w:sz w:val="22"/>
+          <w:szCs w:val="22"/>
+        </w:rPr>
+        <w:t xml:space="preserve">For the second decision, </w:t>
+      </w:r>
+      <w:r>
+        <w:rPr>
+          <w:rFonts w:ascii="Arial" w:hAnsi="Arial" w:cs="Arial"/>
+          <w:sz w:val="22"/>
+          <w:szCs w:val="22"/>
+        </w:rPr>
+        <w:t>the covariates representing wolf and recreational hunting had the same significance while the effect size remained similar</w:t>
+      </w:r>
+      <w:r>
+        <w:rPr>
+          <w:rFonts w:ascii="Arial" w:hAnsi="Arial" w:cs="Arial"/>
+          <w:sz w:val="22"/>
+          <w:szCs w:val="22"/>
+        </w:rPr>
+        <w:t xml:space="preserve"> (Supp. Table 4, 6)</w:t>
+      </w:r>
+      <w:r>
+        <w:rPr>
+          <w:rFonts w:ascii="Arial" w:hAnsi="Arial" w:cs="Arial"/>
+          <w:sz w:val="22"/>
+          <w:szCs w:val="22"/>
+        </w:rPr>
+        <w:t xml:space="preserve">. </w:t>
+      </w:r>
+      <w:r>
+        <w:rPr>
+          <w:rFonts w:ascii="Arial" w:hAnsi="Arial" w:cs="Arial"/>
+          <w:sz w:val="22"/>
+          <w:szCs w:val="22"/>
+        </w:rPr>
+        <w:t>Distance and social remained significant</w:t>
+      </w:r>
+      <w:r>
+        <w:rPr>
+          <w:rFonts w:ascii="Arial" w:hAnsi="Arial" w:cs="Arial"/>
+          <w:sz w:val="22"/>
+          <w:szCs w:val="22"/>
+        </w:rPr>
+        <w:t xml:space="preserve"> </w:t>
+      </w:r>
+      <w:r>
+        <w:rPr>
+          <w:rFonts w:ascii="Arial" w:hAnsi="Arial" w:cs="Arial"/>
+          <w:sz w:val="22"/>
+          <w:szCs w:val="22"/>
+        </w:rPr>
+        <w:t xml:space="preserve">in the reduced model </w:t>
+      </w:r>
+      <w:r>
+        <w:rPr>
+          <w:rFonts w:ascii="Arial" w:hAnsi="Arial" w:cs="Arial"/>
+          <w:sz w:val="22"/>
+          <w:szCs w:val="22"/>
+        </w:rPr>
+        <w:t>(p &lt; 0.05)</w:t>
+      </w:r>
+      <w:r>
+        <w:rPr>
+          <w:rFonts w:ascii="Arial" w:hAnsi="Arial" w:cs="Arial"/>
+          <w:sz w:val="22"/>
+          <w:szCs w:val="22"/>
+        </w:rPr>
+        <w:t xml:space="preserve"> and s</w:t>
+      </w:r>
+      <w:r>
+        <w:rPr>
+          <w:rFonts w:ascii="Arial" w:hAnsi="Arial" w:cs="Arial"/>
+          <w:sz w:val="22"/>
+          <w:szCs w:val="22"/>
+        </w:rPr>
+        <w:t xml:space="preserve">now is not significant (p &gt; 0.14). </w:t>
+      </w:r>
+      <w:r>
+        <w:rPr>
+          <w:rFonts w:ascii="Arial" w:hAnsi="Arial" w:cs="Arial"/>
+          <w:sz w:val="22"/>
+          <w:szCs w:val="22"/>
+        </w:rPr>
+        <w:t xml:space="preserve">Temperature remained insignificant in both </w:t>
+      </w:r>
+      <w:r>
+        <w:rPr>
+          <w:rFonts w:ascii="Arial" w:hAnsi="Arial" w:cs="Arial"/>
+          <w:sz w:val="22"/>
+          <w:szCs w:val="22"/>
+        </w:rPr>
+        <w:t xml:space="preserve">reduced </w:t>
+      </w:r>
+      <w:r>
+        <w:rPr>
+          <w:rFonts w:ascii="Arial" w:hAnsi="Arial" w:cs="Arial"/>
+          <w:sz w:val="22"/>
+          <w:szCs w:val="22"/>
+        </w:rPr>
+        <w:t>models</w:t>
+      </w:r>
+      <w:r>
+        <w:rPr>
+          <w:rFonts w:ascii="Arial" w:hAnsi="Arial" w:cs="Arial"/>
+          <w:sz w:val="22"/>
+          <w:szCs w:val="22"/>
+        </w:rPr>
+        <w:t xml:space="preserve"> (p &gt; 0.12)</w:t>
+      </w:r>
+      <w:r>
+        <w:rPr>
+          <w:rFonts w:ascii="Arial" w:hAnsi="Arial" w:cs="Arial"/>
+          <w:sz w:val="22"/>
+          <w:szCs w:val="22"/>
+        </w:rPr>
+        <w:t xml:space="preserve">. </w:t>
+      </w:r>
+    </w:p>
+    <w:p>
+      <w:pPr>
+        <w:spacing w:line="480" w:lineRule="auto"/>
+        <w:rPr>
+          <w:rFonts w:ascii="Arial" w:hAnsi="Arial" w:cs="Arial"/>
+          <w:sz w:val="22"/>
+          <w:szCs w:val="22"/>
+        </w:rPr>
+      </w:pPr>
+      <w:r>
+        <w:rPr>
+          <w:rFonts w:ascii="Arial" w:hAnsi="Arial" w:cs="Arial"/>
+          <w:sz w:val="22"/>
+          <w:szCs w:val="22"/>
+        </w:rPr>
+        <w:lastRenderedPageBreak/>
+        <w:t xml:space="preserve">Supplemental Table </w:t>
+      </w:r>
+      <w:r>
+        <w:rPr>
+          <w:rFonts w:ascii="Arial" w:hAnsi="Arial" w:cs="Arial"/>
+          <w:sz w:val="22"/>
+          <w:szCs w:val="22"/>
+        </w:rPr>
+        <w:t>5</w:t>
+      </w:r>
+      <w:r>
+        <w:rPr>
+          <w:rFonts w:ascii="Arial" w:hAnsi="Arial" w:cs="Arial"/>
+          <w:sz w:val="22"/>
+          <w:szCs w:val="22"/>
+        </w:rPr>
+        <w:t xml:space="preserve">. Model results from the binomial generalized linear mixed model </w:t>
+      </w:r>
+      <w:r>
+        <w:rPr>
+          <w:rFonts w:ascii="Arial" w:hAnsi="Arial" w:cs="Arial"/>
+          <w:sz w:val="22"/>
+          <w:szCs w:val="22"/>
+        </w:rPr>
+        <w:t xml:space="preserve">for </w:t>
+      </w:r>
+      <w:r>
+        <w:rPr>
+          <w:rFonts w:ascii="Arial" w:hAnsi="Arial" w:cs="Arial"/>
+          <w:sz w:val="22"/>
+          <w:szCs w:val="22"/>
+        </w:rPr>
+        <w:t>the probability of ravens leaving their territory daily</w:t>
+      </w:r>
+      <w:r>
+        <w:rPr>
+          <w:rFonts w:ascii="Arial" w:hAnsi="Arial" w:cs="Arial"/>
+          <w:sz w:val="22"/>
+          <w:szCs w:val="22"/>
+        </w:rPr>
+        <w:t>. This model only includes days in March for a sensitivity analysis on the hunting biomass estimates</w:t>
+      </w:r>
+      <w:r>
+        <w:rPr>
+          <w:rFonts w:ascii="Arial" w:hAnsi="Arial" w:cs="Arial"/>
+          <w:sz w:val="22"/>
+          <w:szCs w:val="22"/>
+        </w:rPr>
+        <w:t xml:space="preserve"> (</w:t>
+      </w:r>
+      <w:proofErr w:type="spellStart"/>
+      <w:r>
+        <w:rPr>
+          <w:rFonts w:ascii="Arial" w:hAnsi="Arial" w:cs="Arial"/>
+          <w:sz w:val="22"/>
+          <w:szCs w:val="22"/>
+        </w:rPr>
+        <w:t>n</w:t>
+      </w:r>
+      <w:r>
+        <w:rPr>
+          <w:rFonts w:ascii="Arial" w:hAnsi="Arial" w:cs="Arial"/>
+          <w:sz w:val="22"/>
+          <w:szCs w:val="22"/>
+          <w:vertAlign w:val="subscript"/>
+        </w:rPr>
+        <w:t>days</w:t>
+      </w:r>
+      <w:proofErr w:type="spellEnd"/>
+      <w:r>
+        <w:rPr>
+          <w:rFonts w:ascii="Arial" w:hAnsi="Arial" w:cs="Arial"/>
+          <w:sz w:val="22"/>
+          <w:szCs w:val="22"/>
+        </w:rPr>
+        <w:t xml:space="preserve"> = 1</w:t>
+      </w:r>
+      <w:r>
+        <w:rPr>
+          <w:rFonts w:ascii="Arial" w:hAnsi="Arial" w:cs="Arial"/>
+          <w:sz w:val="22"/>
+          <w:szCs w:val="22"/>
+        </w:rPr>
+        <w:t>043</w:t>
+      </w:r>
+      <w:r>
+        <w:rPr>
+          <w:rFonts w:ascii="Arial" w:hAnsi="Arial" w:cs="Arial"/>
+          <w:sz w:val="22"/>
+          <w:szCs w:val="22"/>
+        </w:rPr>
+        <w:t>).</w:t>
+      </w:r>
+      <w:r>
+        <w:rPr>
+          <w:rFonts w:ascii="Arial" w:hAnsi="Arial" w:cs="Arial"/>
+          <w:sz w:val="22"/>
+          <w:szCs w:val="22"/>
+        </w:rPr>
+        <w:t xml:space="preserve">Temperature and </w:t>
+      </w:r>
+    </w:p>
+    <w:p>
+      <w:pPr>
+        <w:spacing w:line="480" w:lineRule="auto"/>
+        <w:rPr>
+          <w:rFonts w:ascii="Arial" w:hAnsi="Arial" w:cs="Arial"/>
+          <w:sz w:val="22"/>
+          <w:szCs w:val="22"/>
+        </w:rPr>
+      </w:pPr>
+      <w:r>
+        <w:rPr>
+          <w:rFonts w:ascii="Arial" w:hAnsi="Arial" w:cs="Arial"/>
+          <w:noProof/>
+          <w:sz w:val="22"/>
+          <w:szCs w:val="22"/>
+        </w:rPr>
+        <w:drawing>
+          <wp:inline distT="0" distB="0" distL="0" distR="0" wp14:anchorId="23BCC7A4" wp14:editId="1E4BBACD">
+            <wp:extent cx="3188970" cy="2905125"/>
+            <wp:effectExtent l="0" t="0" r="0" b="9525"/>
+            <wp:docPr id="1962234000" name="Picture 6"/>
+            <wp:cNvGraphicFramePr>
+              <a:graphicFrameLocks xmlns:a="http://schemas.openxmlformats.org/drawingml/2006/main" noChangeAspect="1"/>
+            </wp:cNvGraphicFramePr>
+            <a:graphic xmlns:a="http://schemas.openxmlformats.org/drawingml/2006/main">
+              <a:graphicData uri="http://schemas.openxmlformats.org/drawingml/2006/picture">
+                <pic:pic xmlns:pic="http://schemas.openxmlformats.org/drawingml/2006/picture">
+                  <pic:nvPicPr>
+                    <pic:cNvPr id="0" name="Picture 6"/>
+                    <pic:cNvPicPr>
+                      <a:picLocks noChangeAspect="1" noChangeArrowheads="1"/>
+                    </pic:cNvPicPr>
+                  </pic:nvPicPr>
+                  <pic:blipFill>
+                    <a:blip r:embed="rId9">
+                      <a:extLst>
+                        <a:ext uri="{28A0092B-C50C-407E-A947-70E740481C1C}">
+                          <a14:useLocalDpi xmlns:a14="http://schemas.microsoft.com/office/drawing/2010/main" val="0"/>
+                        </a:ext>
+                      </a:extLst>
+                    </a:blip>
+                    <a:srcRect/>
+                    <a:stretch>
+                      <a:fillRect/>
+                    </a:stretch>
+                  </pic:blipFill>
+                  <pic:spPr bwMode="auto">
+                    <a:xfrm>
+                      <a:off x="0" y="0"/>
+                      <a:ext cx="3188970" cy="2905125"/>
+                    </a:xfrm>
+                    <a:prstGeom prst="rect">
+                      <a:avLst/>
+                    </a:prstGeom>
+                    <a:noFill/>
+                    <a:ln>
+                      <a:noFill/>
+                    </a:ln>
+                  </pic:spPr>
+                </pic:pic>
+              </a:graphicData>
+            </a:graphic>
+          </wp:inline>
+        </w:drawing>
+      </w:r>
+    </w:p>
+    <w:p>
+      <w:pPr>
+        <w:spacing w:line="480" w:lineRule="auto"/>
+        <w:rPr>
+          <w:rFonts w:ascii="Arial" w:hAnsi="Arial" w:cs="Arial"/>
+          <w:sz w:val="22"/>
+          <w:szCs w:val="22"/>
+        </w:rPr>
+      </w:pPr>
+      <w:r>
+        <w:rPr>
+          <w:rFonts w:ascii="Arial" w:hAnsi="Arial" w:cs="Arial"/>
+          <w:sz w:val="22"/>
+          <w:szCs w:val="22"/>
+        </w:rPr>
+        <w:t xml:space="preserve">Supplemental Table </w:t>
+      </w:r>
+      <w:r>
+        <w:rPr>
+          <w:rFonts w:ascii="Arial" w:hAnsi="Arial" w:cs="Arial"/>
+          <w:sz w:val="22"/>
+          <w:szCs w:val="22"/>
+        </w:rPr>
+        <w:t>6</w:t>
+      </w:r>
+      <w:r>
+        <w:rPr>
+          <w:rFonts w:ascii="Arial" w:hAnsi="Arial" w:cs="Arial"/>
+          <w:sz w:val="22"/>
+          <w:szCs w:val="22"/>
+        </w:rPr>
+        <w:t xml:space="preserve">. Model results from the binomial generalized linear mixed model </w:t>
+      </w:r>
+      <w:r>
+        <w:rPr>
+          <w:rFonts w:ascii="Arial" w:hAnsi="Arial" w:cs="Arial"/>
+          <w:sz w:val="22"/>
+          <w:szCs w:val="22"/>
+        </w:rPr>
+        <w:t xml:space="preserve">for </w:t>
+      </w:r>
+      <w:r>
+        <w:rPr>
+          <w:rFonts w:ascii="Arial" w:hAnsi="Arial" w:cs="Arial"/>
+          <w:sz w:val="22"/>
+          <w:szCs w:val="22"/>
+        </w:rPr>
+        <w:t>the probability of ravens</w:t>
+      </w:r>
+      <w:r>
+        <w:rPr>
+          <w:rFonts w:ascii="Arial" w:hAnsi="Arial" w:cs="Arial"/>
+          <w:sz w:val="22"/>
+          <w:szCs w:val="22"/>
+        </w:rPr>
+        <w:t xml:space="preserve"> </w:t>
+      </w:r>
+      <w:r>
+        <w:rPr>
+          <w:rFonts w:ascii="Arial" w:hAnsi="Arial" w:cs="Arial"/>
+          <w:sz w:val="22"/>
+          <w:szCs w:val="22"/>
+        </w:rPr>
+        <w:t>visiting the hunting areas surrounding Gardiner, MT when they choose to leave their territory daily</w:t>
+      </w:r>
+      <w:r>
+        <w:rPr>
+          <w:rFonts w:ascii="Arial" w:hAnsi="Arial" w:cs="Arial"/>
+          <w:sz w:val="22"/>
+          <w:szCs w:val="22"/>
+        </w:rPr>
+        <w:t>. This model only includes days in March for a sensitivity analysis on the hunting biomass estimates</w:t>
+      </w:r>
+      <w:r>
+        <w:rPr>
+          <w:rFonts w:ascii="Arial" w:hAnsi="Arial" w:cs="Arial"/>
+          <w:sz w:val="22"/>
+          <w:szCs w:val="22"/>
+        </w:rPr>
+        <w:t xml:space="preserve"> (</w:t>
+      </w:r>
+      <w:proofErr w:type="spellStart"/>
+      <w:r>
+        <w:rPr>
+          <w:rFonts w:ascii="Arial" w:hAnsi="Arial" w:cs="Arial"/>
+          <w:sz w:val="22"/>
+          <w:szCs w:val="22"/>
+        </w:rPr>
+        <w:t>n</w:t>
+      </w:r>
+      <w:r>
+        <w:rPr>
+          <w:rFonts w:ascii="Arial" w:hAnsi="Arial" w:cs="Arial"/>
+          <w:sz w:val="22"/>
+          <w:szCs w:val="22"/>
+          <w:vertAlign w:val="subscript"/>
+        </w:rPr>
+        <w:t>days</w:t>
+      </w:r>
+      <w:proofErr w:type="spellEnd"/>
+      <w:r>
+        <w:rPr>
+          <w:rFonts w:ascii="Arial" w:hAnsi="Arial" w:cs="Arial"/>
+          <w:sz w:val="22"/>
+          <w:szCs w:val="22"/>
+        </w:rPr>
+        <w:t xml:space="preserve"> = </w:t>
+      </w:r>
+      <w:r>
+        <w:rPr>
+          <w:rFonts w:ascii="Arial" w:hAnsi="Arial" w:cs="Arial"/>
+          <w:sz w:val="22"/>
+          <w:szCs w:val="22"/>
+        </w:rPr>
+        <w:t>866</w:t>
+      </w:r>
+      <w:r>
+        <w:rPr>
+          <w:rFonts w:ascii="Arial" w:hAnsi="Arial" w:cs="Arial"/>
+          <w:sz w:val="22"/>
+          <w:szCs w:val="22"/>
+        </w:rPr>
+        <w:t>).</w:t>
+      </w:r>
+    </w:p>
+    <w:p>
+      <w:pPr>
+        <w:spacing w:line="480" w:lineRule="auto"/>
+        <w:rPr>
+          <w:rFonts w:ascii="Arial" w:hAnsi="Arial" w:cs="Arial"/>
+          <w:sz w:val="22"/>
+          <w:szCs w:val="22"/>
+        </w:rPr>
+      </w:pPr>
+      <w:r>
+        <w:rPr>
+          <w:rFonts w:ascii="Arial" w:hAnsi="Arial" w:cs="Arial"/>
+          <w:noProof/>
+          <w:sz w:val="22"/>
+          <w:szCs w:val="22"/>
+        </w:rPr>
+        <w:drawing>
+          <wp:inline distT="0" distB="0" distL="0" distR="0" wp14:anchorId="0933647E" wp14:editId="13A2ED73">
+            <wp:extent cx="3165475" cy="2419350"/>
+            <wp:effectExtent l="0" t="0" r="0" b="0"/>
+            <wp:docPr id="319489395" name="Picture 5"/>
+            <wp:cNvGraphicFramePr>
+              <a:graphicFrameLocks xmlns:a="http://schemas.openxmlformats.org/drawingml/2006/main" noChangeAspect="1"/>
+            </wp:cNvGraphicFramePr>
+            <a:graphic xmlns:a="http://schemas.openxmlformats.org/drawingml/2006/main">
+              <a:graphicData uri="http://schemas.openxmlformats.org/drawingml/2006/picture">
+                <pic:pic xmlns:pic="http://schemas.openxmlformats.org/drawingml/2006/picture">
+                  <pic:nvPicPr>
+                    <pic:cNvPr id="0" name="Picture 5"/>
+                    <pic:cNvPicPr>
+                      <a:picLocks noChangeAspect="1" noChangeArrowheads="1"/>
+                    </pic:cNvPicPr>
+                  </pic:nvPicPr>
+                  <pic:blipFill>
+                    <a:blip r:embed="rId10">
+                      <a:extLst>
+                        <a:ext uri="{28A0092B-C50C-407E-A947-70E740481C1C}">
+                          <a14:useLocalDpi xmlns:a14="http://schemas.microsoft.com/office/drawing/2010/main" val="0"/>
+                        </a:ext>
+                      </a:extLst>
+                    </a:blip>
+                    <a:srcRect/>
+                    <a:stretch>
+                      <a:fillRect/>
+                    </a:stretch>
+                  </pic:blipFill>
+                  <pic:spPr bwMode="auto">
+                    <a:xfrm>
+                      <a:off x="0" y="0"/>
+                      <a:ext cx="3165475" cy="2419350"/>
+                    </a:xfrm>
+                    <a:prstGeom prst="rect">
+                      <a:avLst/>
+                    </a:prstGeom>
+                    <a:noFill/>
+                    <a:ln>
+                      <a:noFill/>
+                    </a:ln>
+                  </pic:spPr>
+                </pic:pic>
+              </a:graphicData>
+            </a:graphic>
+          </wp:inline>
+        </w:drawing>
+      </w:r>
+    </w:p>
+    <w:p>
+      <w:pPr>
+        <w:spacing w:line="480" w:lineRule="auto"/>
+        <w:rPr>
+          <w:rFonts w:ascii="Arial" w:hAnsi="Arial" w:cs="Arial"/>
+          <w:b/>
+          <w:bCs/>
+          <w:sz w:val="22"/>
+          <w:szCs w:val="22"/>
+        </w:rPr>
+      </w:pPr>
+      <w:r>
+        <w:rPr>
+          <w:rFonts w:ascii="Arial" w:hAnsi="Arial" w:cs="Arial"/>
+          <w:b/>
+          <w:bCs/>
+          <w:sz w:val="22"/>
+          <w:szCs w:val="22"/>
+        </w:rPr>
+        <w:lastRenderedPageBreak/>
+        <w:t>Discussion</w:t>
+      </w:r>
+    </w:p>
+    <w:p>
+      <w:pPr>
+        <w:spacing w:line="480" w:lineRule="auto"/>
+        <w:rPr>
+          <w:rFonts w:ascii="Arial" w:hAnsi="Arial" w:cs="Arial"/>
+          <w:sz w:val="22"/>
+          <w:szCs w:val="22"/>
+        </w:rPr>
+      </w:pPr>
+      <w:r>
+        <w:rPr>
+          <w:rFonts w:ascii="Arial" w:hAnsi="Arial" w:cs="Arial"/>
+          <w:sz w:val="22"/>
+          <w:szCs w:val="22"/>
+        </w:rPr>
+        <w:t>Based on our sensitivity analysis of the model, excluding the periods of MTFWP hunting, o</w:t>
+      </w:r>
+      <w:r>
+        <w:rPr>
+          <w:rFonts w:ascii="Arial" w:hAnsi="Arial" w:cs="Arial"/>
+          <w:sz w:val="22"/>
+          <w:szCs w:val="22"/>
+        </w:rPr>
+        <w:t>ur method of calculating estimated biomass for the MTFWP season d</w:t>
+      </w:r>
+      <w:r>
+        <w:rPr>
+          <w:rFonts w:ascii="Arial" w:hAnsi="Arial" w:cs="Arial"/>
+          <w:sz w:val="22"/>
+          <w:szCs w:val="22"/>
+        </w:rPr>
+        <w:t>id</w:t>
+      </w:r>
+      <w:r>
+        <w:rPr>
+          <w:rFonts w:ascii="Arial" w:hAnsi="Arial" w:cs="Arial"/>
+          <w:sz w:val="22"/>
+          <w:szCs w:val="22"/>
+        </w:rPr>
+        <w:t xml:space="preserve"> not create any large changes in the </w:t>
+      </w:r>
+      <w:r>
+        <w:rPr>
+          <w:rFonts w:ascii="Arial" w:hAnsi="Arial" w:cs="Arial"/>
+          <w:sz w:val="22"/>
+          <w:szCs w:val="22"/>
+        </w:rPr>
+        <w:t>e</w:t>
+      </w:r>
+      <w:r>
+        <w:rPr>
+          <w:rFonts w:ascii="Arial" w:hAnsi="Arial" w:cs="Arial"/>
+          <w:sz w:val="22"/>
+          <w:szCs w:val="22"/>
+        </w:rPr>
+        <w:t xml:space="preserve">ffects of the </w:t>
+      </w:r>
+      <w:r>
+        <w:rPr>
+          <w:rFonts w:ascii="Arial" w:hAnsi="Arial" w:cs="Arial"/>
+          <w:sz w:val="22"/>
+          <w:szCs w:val="22"/>
+        </w:rPr>
+        <w:t>primary food availability</w:t>
+      </w:r>
+      <w:r>
+        <w:rPr>
+          <w:rFonts w:ascii="Arial" w:hAnsi="Arial" w:cs="Arial"/>
+          <w:sz w:val="22"/>
+          <w:szCs w:val="22"/>
+        </w:rPr>
+        <w:t xml:space="preserve"> covariates. </w:t>
+      </w:r>
+      <w:r>
+        <w:rPr>
+          <w:rFonts w:ascii="Arial" w:hAnsi="Arial" w:cs="Arial"/>
+          <w:sz w:val="22"/>
+          <w:szCs w:val="22"/>
+        </w:rPr>
+        <w:t>The other significant covariate</w:t>
+      </w:r>
+      <w:r>
+        <w:rPr>
+          <w:rFonts w:ascii="Arial" w:hAnsi="Arial" w:cs="Arial"/>
+          <w:sz w:val="22"/>
+          <w:szCs w:val="22"/>
+        </w:rPr>
+        <w:t xml:space="preserve">s, especially snow depth, </w:t>
+      </w:r>
+      <w:r>
+        <w:rPr>
+          <w:rFonts w:ascii="Arial" w:hAnsi="Arial" w:cs="Arial"/>
+          <w:sz w:val="22"/>
+          <w:szCs w:val="22"/>
+        </w:rPr>
+        <w:t xml:space="preserve">were more sensitive to the reduced dataset. This likely indicates that those covariates are linked with the </w:t>
+      </w:r>
+      <w:r>
+        <w:rPr>
+          <w:rFonts w:ascii="Arial" w:hAnsi="Arial" w:cs="Arial"/>
+          <w:sz w:val="22"/>
+          <w:szCs w:val="22"/>
+        </w:rPr>
+        <w:t xml:space="preserve">recreational </w:t>
+      </w:r>
+      <w:r>
+        <w:rPr>
+          <w:rFonts w:ascii="Arial" w:hAnsi="Arial" w:cs="Arial"/>
+          <w:sz w:val="22"/>
+          <w:szCs w:val="22"/>
+        </w:rPr>
+        <w:t>hunting biomass. Snow depth can chang</w:t>
+      </w:r>
+      <w:r>
+        <w:rPr>
+          <w:rFonts w:ascii="Arial" w:hAnsi="Arial" w:cs="Arial"/>
+          <w:sz w:val="22"/>
+          <w:szCs w:val="22"/>
+        </w:rPr>
+        <w:t>e</w:t>
+      </w:r>
+      <w:r>
+        <w:rPr>
+          <w:rFonts w:ascii="Arial" w:hAnsi="Arial" w:cs="Arial"/>
+          <w:sz w:val="22"/>
+          <w:szCs w:val="22"/>
+        </w:rPr>
+        <w:t xml:space="preserve"> the efficiency of hunter take by altering detectability of ungulates</w:t>
+      </w:r>
+      <w:r>
+        <w:rPr>
+          <w:rFonts w:ascii="Arial" w:hAnsi="Arial" w:cs="Arial"/>
+          <w:sz w:val="22"/>
+          <w:szCs w:val="22"/>
+        </w:rPr>
+        <w:t xml:space="preserve"> (</w:t>
+      </w:r>
+      <w:r>
+        <w:rPr>
+          <w:rFonts w:ascii="Arial" w:hAnsi="Arial" w:cs="Arial"/>
+          <w:sz w:val="22"/>
+          <w:szCs w:val="22"/>
+        </w:rPr>
+        <w:t>Zagata and Haugen 1974</w:t>
+      </w:r>
+      <w:r>
+        <w:rPr>
+          <w:rFonts w:ascii="Arial" w:hAnsi="Arial" w:cs="Arial"/>
+          <w:sz w:val="22"/>
+          <w:szCs w:val="22"/>
+        </w:rPr>
+        <w:t>)</w:t>
+      </w:r>
+      <w:r>
+        <w:rPr>
+          <w:rFonts w:ascii="Arial" w:hAnsi="Arial" w:cs="Arial"/>
+          <w:sz w:val="22"/>
+          <w:szCs w:val="22"/>
+        </w:rPr>
+        <w:t>, as well as being connected to the timing of their migration into huntable areas</w:t>
+      </w:r>
+      <w:r>
+        <w:rPr>
+          <w:rFonts w:ascii="Arial" w:hAnsi="Arial" w:cs="Arial"/>
+          <w:sz w:val="22"/>
+          <w:szCs w:val="22"/>
+        </w:rPr>
+        <w:t xml:space="preserve"> (Geremia et al. 2011)</w:t>
+      </w:r>
+      <w:r>
+        <w:rPr>
+          <w:rFonts w:ascii="Arial" w:hAnsi="Arial" w:cs="Arial"/>
+          <w:sz w:val="22"/>
+          <w:szCs w:val="22"/>
+        </w:rPr>
+        <w:t>.</w:t>
+      </w:r>
+      <w:r>
+        <w:rPr>
+          <w:rFonts w:ascii="Arial" w:hAnsi="Arial" w:cs="Arial"/>
+          <w:sz w:val="22"/>
+          <w:szCs w:val="22"/>
+        </w:rPr>
+        <w:t xml:space="preserve"> </w:t>
+      </w:r>
+      <w:r>
+        <w:rPr>
+          <w:rFonts w:ascii="Arial" w:hAnsi="Arial" w:cs="Arial"/>
+          <w:sz w:val="22"/>
+          <w:szCs w:val="22"/>
+        </w:rPr>
+        <w:t>Generally, we are confident that the hunting biomass covariate in the main model is representative.</w:t>
       </w:r>
     </w:p>
     <w:sectPr>

</xml_diff>